<commit_message>
Download license pdf API addition
</commit_message>
<xml_diff>
--- a/templates/License_Agreement_Template.docx
+++ b/templates/License_Agreement_Template.docx
@@ -307,19 +307,22 @@
     <w:tbl>
       <w:tblPr>
         <w:tblStyle w:val="TableGrid"/>
-        <w:tblW w:w="0" w:type="auto"/>
+        <w:tblW w:w="9129" w:type="dxa"/>
         <w:tblInd w:w="360" w:type="dxa"/>
         <w:tblLook w:val="04A0" w:firstRow="1" w:lastRow="0" w:firstColumn="1" w:lastColumn="0" w:noHBand="0" w:noVBand="1"/>
       </w:tblPr>
       <w:tblGrid>
-        <w:gridCol w:w="1053"/>
-        <w:gridCol w:w="3402"/>
-        <w:gridCol w:w="4201"/>
+        <w:gridCol w:w="1110"/>
+        <w:gridCol w:w="3588"/>
+        <w:gridCol w:w="4431"/>
       </w:tblGrid>
       <w:tr>
+        <w:trPr>
+          <w:trHeight w:val="280"/>
+        </w:trPr>
         <w:tc>
           <w:tcPr>
-            <w:tcW w:w="1053" w:type="dxa"/>
+            <w:tcW w:w="1110" w:type="dxa"/>
           </w:tcPr>
           <w:p>
             <w:pPr>
@@ -351,7 +354,7 @@
         </w:tc>
         <w:tc>
           <w:tcPr>
-            <w:tcW w:w="3402" w:type="dxa"/>
+            <w:tcW w:w="3588" w:type="dxa"/>
           </w:tcPr>
           <w:p>
             <w:pPr>
@@ -371,7 +374,7 @@
         </w:tc>
         <w:tc>
           <w:tcPr>
-            <w:tcW w:w="4201" w:type="dxa"/>
+            <w:tcW w:w="4431" w:type="dxa"/>
           </w:tcPr>
           <w:p>
             <w:pPr>
@@ -392,9 +395,12 @@
         </w:tc>
       </w:tr>
       <w:tr>
+        <w:trPr>
+          <w:trHeight w:val="266"/>
+        </w:trPr>
         <w:tc>
           <w:tcPr>
-            <w:tcW w:w="1053" w:type="dxa"/>
+            <w:tcW w:w="1110" w:type="dxa"/>
           </w:tcPr>
           <w:p>
             <w:pPr>
@@ -417,7 +423,7 @@
         </w:tc>
         <w:tc>
           <w:tcPr>
-            <w:tcW w:w="3402" w:type="dxa"/>
+            <w:tcW w:w="3588" w:type="dxa"/>
           </w:tcPr>
           <w:p>
             <w:pPr>
@@ -456,7 +462,7 @@
         </w:tc>
         <w:tc>
           <w:tcPr>
-            <w:tcW w:w="4201" w:type="dxa"/>
+            <w:tcW w:w="4431" w:type="dxa"/>
           </w:tcPr>
           <w:p>
             <w:pPr>
@@ -484,9 +490,12 @@
         </w:tc>
       </w:tr>
       <w:tr>
+        <w:trPr>
+          <w:trHeight w:val="280"/>
+        </w:trPr>
         <w:tc>
           <w:tcPr>
-            <w:tcW w:w="1053" w:type="dxa"/>
+            <w:tcW w:w="1110" w:type="dxa"/>
           </w:tcPr>
           <w:p>
             <w:pPr>
@@ -509,7 +518,7 @@
         </w:tc>
         <w:tc>
           <w:tcPr>
-            <w:tcW w:w="3402" w:type="dxa"/>
+            <w:tcW w:w="3588" w:type="dxa"/>
           </w:tcPr>
           <w:p>
             <w:pPr>
@@ -532,20 +541,17 @@
                 <w:sz w:val="20"/>
                 <w:szCs w:val="20"/>
               </w:rPr>
-              <w:t>Address</w:t>
+              <w:t>Email</w:t>
             </w:r>
           </w:p>
         </w:tc>
         <w:tc>
           <w:tcPr>
-            <w:tcW w:w="4201" w:type="dxa"/>
+            <w:tcW w:w="4431" w:type="dxa"/>
           </w:tcPr>
           <w:p>
             <w:pPr>
               <w:pStyle w:val="ListParagraph"/>
-              <w:tabs>
-                <w:tab w:val="left" w:pos="240"/>
-              </w:tabs>
               <w:spacing w:before="0" w:after="0"/>
               <w:ind w:left="0"/>
               <w:rPr>
@@ -560,15 +566,34 @@
                 <w:sz w:val="20"/>
                 <w:szCs w:val="20"/>
               </w:rPr>
-              <w:t>{address}</w:t>
+              <w:t>{</w:t>
+            </w:r>
+            <w:r>
+              <w:rPr>
+                <w:rFonts w:ascii="Times New Roman" w:hAnsi="Times New Roman" w:cs="Times New Roman"/>
+                <w:sz w:val="20"/>
+                <w:szCs w:val="20"/>
+              </w:rPr>
+              <w:t>email</w:t>
+            </w:r>
+            <w:r>
+              <w:rPr>
+                <w:rFonts w:ascii="Times New Roman" w:hAnsi="Times New Roman" w:cs="Times New Roman"/>
+                <w:sz w:val="20"/>
+                <w:szCs w:val="20"/>
+              </w:rPr>
+              <w:t>}</w:t>
             </w:r>
           </w:p>
         </w:tc>
       </w:tr>
       <w:tr>
+        <w:trPr>
+          <w:trHeight w:val="280"/>
+        </w:trPr>
         <w:tc>
           <w:tcPr>
-            <w:tcW w:w="1053" w:type="dxa"/>
+            <w:tcW w:w="1110" w:type="dxa"/>
           </w:tcPr>
           <w:p>
             <w:pPr>
@@ -591,7 +616,7 @@
         </w:tc>
         <w:tc>
           <w:tcPr>
-            <w:tcW w:w="3402" w:type="dxa"/>
+            <w:tcW w:w="3588" w:type="dxa"/>
           </w:tcPr>
           <w:p>
             <w:pPr>
@@ -614,13 +639,13 @@
                 <w:sz w:val="20"/>
                 <w:szCs w:val="20"/>
               </w:rPr>
-              <w:t>Email</w:t>
+              <w:t>Contact</w:t>
             </w:r>
           </w:p>
         </w:tc>
         <w:tc>
           <w:tcPr>
-            <w:tcW w:w="4201" w:type="dxa"/>
+            <w:tcW w:w="4431" w:type="dxa"/>
           </w:tcPr>
           <w:p>
             <w:pPr>
@@ -639,31 +664,18 @@
                 <w:sz w:val="20"/>
                 <w:szCs w:val="20"/>
               </w:rPr>
-              <w:t>{</w:t>
-            </w:r>
-            <w:r>
-              <w:rPr>
-                <w:rFonts w:ascii="Times New Roman" w:hAnsi="Times New Roman" w:cs="Times New Roman"/>
-                <w:sz w:val="20"/>
-                <w:szCs w:val="20"/>
-              </w:rPr>
-              <w:t>email</w:t>
-            </w:r>
-            <w:r>
-              <w:rPr>
-                <w:rFonts w:ascii="Times New Roman" w:hAnsi="Times New Roman" w:cs="Times New Roman"/>
-                <w:sz w:val="20"/>
-                <w:szCs w:val="20"/>
-              </w:rPr>
-              <w:t>}</w:t>
+              <w:t>{mobile}</w:t>
             </w:r>
           </w:p>
         </w:tc>
       </w:tr>
       <w:tr>
+        <w:trPr>
+          <w:trHeight w:val="266"/>
+        </w:trPr>
         <w:tc>
           <w:tcPr>
-            <w:tcW w:w="1053" w:type="dxa"/>
+            <w:tcW w:w="1110" w:type="dxa"/>
           </w:tcPr>
           <w:p>
             <w:pPr>
@@ -686,7 +698,7 @@
         </w:tc>
         <w:tc>
           <w:tcPr>
-            <w:tcW w:w="3402" w:type="dxa"/>
+            <w:tcW w:w="3588" w:type="dxa"/>
           </w:tcPr>
           <w:p>
             <w:pPr>
@@ -709,189 +721,13 @@
                 <w:sz w:val="20"/>
                 <w:szCs w:val="20"/>
               </w:rPr>
-              <w:t>Contact</w:t>
+              <w:t>License Purchase Date</w:t>
             </w:r>
           </w:p>
         </w:tc>
         <w:tc>
           <w:tcPr>
-            <w:tcW w:w="4201" w:type="dxa"/>
-          </w:tcPr>
-          <w:p>
-            <w:pPr>
-              <w:pStyle w:val="ListParagraph"/>
-              <w:spacing w:before="0" w:after="0"/>
-              <w:ind w:left="0"/>
-              <w:rPr>
-                <w:rFonts w:ascii="Times New Roman" w:hAnsi="Times New Roman" w:cs="Times New Roman"/>
-                <w:sz w:val="20"/>
-                <w:szCs w:val="20"/>
-              </w:rPr>
-            </w:pPr>
-            <w:r>
-              <w:rPr>
-                <w:rFonts w:ascii="Times New Roman" w:hAnsi="Times New Roman" w:cs="Times New Roman"/>
-                <w:sz w:val="20"/>
-                <w:szCs w:val="20"/>
-              </w:rPr>
-              <w:t>{mobile}</w:t>
-            </w:r>
-          </w:p>
-        </w:tc>
-      </w:tr>
-      <w:tr>
-        <w:tc>
-          <w:tcPr>
-            <w:tcW w:w="1053" w:type="dxa"/>
-          </w:tcPr>
-          <w:p>
-            <w:pPr>
-              <w:pStyle w:val="ListParagraph"/>
-              <w:numPr>
-                <w:ilvl w:val="0"/>
-                <w:numId w:val="35"/>
-              </w:numPr>
-              <w:spacing w:before="0" w:after="0"/>
-              <w:rPr>
-                <w:rFonts w:ascii="Times New Roman" w:hAnsi="Times New Roman" w:cs="Times New Roman"/>
-                <w:b/>
-                <w:bCs/>
-                <w:sz w:val="20"/>
-                <w:szCs w:val="20"/>
-                <w:u w:val="single"/>
-              </w:rPr>
-            </w:pPr>
-          </w:p>
-        </w:tc>
-        <w:tc>
-          <w:tcPr>
-            <w:tcW w:w="3402" w:type="dxa"/>
-          </w:tcPr>
-          <w:p>
-            <w:pPr>
-              <w:pStyle w:val="ListParagraph"/>
-              <w:spacing w:before="0" w:after="0"/>
-              <w:ind w:left="0"/>
-              <w:rPr>
-                <w:rFonts w:ascii="Times New Roman" w:hAnsi="Times New Roman" w:cs="Times New Roman"/>
-                <w:b/>
-                <w:bCs/>
-                <w:sz w:val="20"/>
-                <w:szCs w:val="20"/>
-              </w:rPr>
-            </w:pPr>
-            <w:r>
-              <w:rPr>
-                <w:rFonts w:ascii="Times New Roman" w:hAnsi="Times New Roman" w:cs="Times New Roman"/>
-                <w:b/>
-                <w:bCs/>
-                <w:sz w:val="20"/>
-                <w:szCs w:val="20"/>
-              </w:rPr>
-              <w:t xml:space="preserve">Company Affiliated With:  </w:t>
-            </w:r>
-          </w:p>
-        </w:tc>
-        <w:tc>
-          <w:tcPr>
-            <w:tcW w:w="4201" w:type="dxa"/>
-          </w:tcPr>
-          <w:p>
-            <w:pPr>
-              <w:pStyle w:val="ListParagraph"/>
-              <w:spacing w:before="0" w:after="0"/>
-              <w:ind w:left="0"/>
-              <w:rPr>
-                <w:rFonts w:ascii="Times New Roman" w:hAnsi="Times New Roman" w:cs="Times New Roman"/>
-                <w:sz w:val="20"/>
-                <w:szCs w:val="20"/>
-              </w:rPr>
-            </w:pPr>
-            <w:r>
-              <w:rPr>
-                <w:rFonts w:ascii="Times New Roman" w:hAnsi="Times New Roman" w:cs="Times New Roman"/>
-                <w:sz w:val="20"/>
-                <w:szCs w:val="20"/>
-              </w:rPr>
-              <w:t>{</w:t>
-            </w:r>
-            <w:proofErr w:type="spellStart"/>
-            <w:r>
-              <w:rPr>
-                <w:rFonts w:ascii="Times New Roman" w:hAnsi="Times New Roman" w:cs="Times New Roman"/>
-                <w:sz w:val="20"/>
-                <w:szCs w:val="20"/>
-              </w:rPr>
-              <w:t>companyName</w:t>
-            </w:r>
-            <w:proofErr w:type="spellEnd"/>
-            <w:r>
-              <w:rPr>
-                <w:rFonts w:ascii="Times New Roman" w:hAnsi="Times New Roman" w:cs="Times New Roman"/>
-                <w:sz w:val="20"/>
-                <w:szCs w:val="20"/>
-              </w:rPr>
-              <w:t>}</w:t>
-            </w:r>
-          </w:p>
-        </w:tc>
-      </w:tr>
-      <w:tr>
-        <w:tc>
-          <w:tcPr>
-            <w:tcW w:w="1053" w:type="dxa"/>
-          </w:tcPr>
-          <w:p>
-            <w:pPr>
-              <w:pStyle w:val="ListParagraph"/>
-              <w:numPr>
-                <w:ilvl w:val="0"/>
-                <w:numId w:val="35"/>
-              </w:numPr>
-              <w:spacing w:before="0" w:after="0"/>
-              <w:rPr>
-                <w:rFonts w:ascii="Times New Roman" w:hAnsi="Times New Roman" w:cs="Times New Roman"/>
-                <w:b/>
-                <w:bCs/>
-                <w:sz w:val="20"/>
-                <w:szCs w:val="20"/>
-                <w:u w:val="single"/>
-              </w:rPr>
-            </w:pPr>
-          </w:p>
-        </w:tc>
-        <w:tc>
-          <w:tcPr>
-            <w:tcW w:w="3402" w:type="dxa"/>
-          </w:tcPr>
-          <w:p>
-            <w:pPr>
-              <w:pStyle w:val="ListParagraph"/>
-              <w:spacing w:before="0" w:after="0"/>
-              <w:ind w:left="0"/>
-              <w:rPr>
-                <w:rFonts w:ascii="Times New Roman" w:hAnsi="Times New Roman" w:cs="Times New Roman"/>
-                <w:b/>
-                <w:bCs/>
-                <w:sz w:val="20"/>
-                <w:szCs w:val="20"/>
-              </w:rPr>
-            </w:pPr>
-            <w:r>
-              <w:rPr>
-                <w:rFonts w:ascii="Times New Roman" w:hAnsi="Times New Roman" w:cs="Times New Roman"/>
-                <w:b/>
-                <w:bCs/>
-                <w:sz w:val="20"/>
-                <w:szCs w:val="20"/>
-              </w:rPr>
-              <w:t>License Purchase Date</w:t>
-            </w:r>
-          </w:p>
-        </w:tc>
-        <w:tc>
-          <w:tcPr>
-            <w:tcW w:w="4201" w:type="dxa"/>
+            <w:tcW w:w="4431" w:type="dxa"/>
           </w:tcPr>
           <w:p>
             <w:pPr>
@@ -923,103 +759,6 @@
               </w:rPr>
               <w:t>date</w:t>
             </w:r>
-            <w:r>
-              <w:rPr>
-                <w:rFonts w:ascii="Times New Roman" w:hAnsi="Times New Roman" w:cs="Times New Roman"/>
-                <w:sz w:val="20"/>
-                <w:szCs w:val="20"/>
-              </w:rPr>
-              <w:t>}</w:t>
-            </w:r>
-          </w:p>
-        </w:tc>
-      </w:tr>
-      <w:tr>
-        <w:tc>
-          <w:tcPr>
-            <w:tcW w:w="1053" w:type="dxa"/>
-          </w:tcPr>
-          <w:p>
-            <w:pPr>
-              <w:pStyle w:val="ListParagraph"/>
-              <w:numPr>
-                <w:ilvl w:val="0"/>
-                <w:numId w:val="35"/>
-              </w:numPr>
-              <w:spacing w:before="0" w:after="0"/>
-              <w:rPr>
-                <w:rFonts w:ascii="Times New Roman" w:hAnsi="Times New Roman" w:cs="Times New Roman"/>
-                <w:b/>
-                <w:bCs/>
-                <w:sz w:val="20"/>
-                <w:szCs w:val="20"/>
-                <w:u w:val="single"/>
-              </w:rPr>
-            </w:pPr>
-          </w:p>
-        </w:tc>
-        <w:tc>
-          <w:tcPr>
-            <w:tcW w:w="3402" w:type="dxa"/>
-          </w:tcPr>
-          <w:p>
-            <w:pPr>
-              <w:pStyle w:val="ListParagraph"/>
-              <w:spacing w:before="0" w:after="0"/>
-              <w:ind w:left="0"/>
-              <w:rPr>
-                <w:rFonts w:ascii="Times New Roman" w:hAnsi="Times New Roman" w:cs="Times New Roman"/>
-                <w:b/>
-                <w:bCs/>
-                <w:sz w:val="20"/>
-                <w:szCs w:val="20"/>
-              </w:rPr>
-            </w:pPr>
-            <w:r>
-              <w:rPr>
-                <w:rFonts w:ascii="Times New Roman" w:hAnsi="Times New Roman" w:cs="Times New Roman"/>
-                <w:b/>
-                <w:bCs/>
-                <w:sz w:val="20"/>
-                <w:szCs w:val="20"/>
-              </w:rPr>
-              <w:t>Order ID</w:t>
-            </w:r>
-          </w:p>
-        </w:tc>
-        <w:tc>
-          <w:tcPr>
-            <w:tcW w:w="4201" w:type="dxa"/>
-          </w:tcPr>
-          <w:p>
-            <w:pPr>
-              <w:pStyle w:val="ListParagraph"/>
-              <w:spacing w:before="0" w:after="0"/>
-              <w:ind w:left="0"/>
-              <w:rPr>
-                <w:rFonts w:ascii="Times New Roman" w:hAnsi="Times New Roman" w:cs="Times New Roman"/>
-                <w:sz w:val="20"/>
-                <w:szCs w:val="20"/>
-              </w:rPr>
-            </w:pPr>
-            <w:r>
-              <w:rPr>
-                <w:rFonts w:ascii="Times New Roman" w:hAnsi="Times New Roman" w:cs="Times New Roman"/>
-                <w:sz w:val="20"/>
-                <w:szCs w:val="20"/>
-              </w:rPr>
-              <w:t>{</w:t>
-            </w:r>
-            <w:proofErr w:type="spellStart"/>
-            <w:r>
-              <w:rPr>
-                <w:rFonts w:ascii="Times New Roman" w:hAnsi="Times New Roman" w:cs="Times New Roman"/>
-                <w:sz w:val="20"/>
-                <w:szCs w:val="20"/>
-              </w:rPr>
-              <w:t>orderId</w:t>
-            </w:r>
-            <w:proofErr w:type="spellEnd"/>
             <w:r>
               <w:rPr>
                 <w:rFonts w:ascii="Times New Roman" w:hAnsi="Times New Roman" w:cs="Times New Roman"/>
@@ -1977,26 +1716,34 @@
                 <w:sz w:val="20"/>
                 <w:szCs w:val="20"/>
               </w:rPr>
+              <w:t xml:space="preserve">The </w:t>
+            </w:r>
+            <w:proofErr w:type="gramStart"/>
+            <w:r>
+              <w:rPr>
+                <w:rFonts w:ascii="Times New Roman" w:hAnsi="Times New Roman" w:cs="Times New Roman"/>
+                <w:sz w:val="20"/>
+                <w:szCs w:val="20"/>
+              </w:rPr>
+              <w:t>Audio Visual</w:t>
+            </w:r>
+            <w:proofErr w:type="gramEnd"/>
+            <w:r>
+              <w:rPr>
+                <w:rFonts w:ascii="Times New Roman" w:hAnsi="Times New Roman" w:cs="Times New Roman"/>
+                <w:sz w:val="20"/>
+                <w:szCs w:val="20"/>
+              </w:rPr>
+              <w:t xml:space="preserve"> Content or any portion thereof, or any of the materials used and/or to be used in the production shall not violate or infringe upon the </w:t>
+            </w:r>
+            <w:r>
+              <w:rPr>
+                <w:rFonts w:ascii="Times New Roman" w:hAnsi="Times New Roman" w:cs="Times New Roman"/>
+                <w:sz w:val="20"/>
+                <w:szCs w:val="20"/>
+              </w:rPr>
               <w:lastRenderedPageBreak/>
-              <w:t xml:space="preserve">The </w:t>
-            </w:r>
-            <w:proofErr w:type="gramStart"/>
-            <w:r>
-              <w:rPr>
-                <w:rFonts w:ascii="Times New Roman" w:hAnsi="Times New Roman" w:cs="Times New Roman"/>
-                <w:sz w:val="20"/>
-                <w:szCs w:val="20"/>
-              </w:rPr>
-              <w:t>Audio Visual</w:t>
-            </w:r>
-            <w:proofErr w:type="gramEnd"/>
-            <w:r>
-              <w:rPr>
-                <w:rFonts w:ascii="Times New Roman" w:hAnsi="Times New Roman" w:cs="Times New Roman"/>
-                <w:sz w:val="20"/>
-                <w:szCs w:val="20"/>
-              </w:rPr>
-              <w:t xml:space="preserve"> Content or any portion thereof, or any of the materials used and/or to be used in the production shall not violate or infringe upon the trademark or trade names or any other right of any third party and it shall not be objectionable. obscene, blasphemous, plagiarized, libelous or defamatory or derogatory to any religion or belief, contrary to public policy, or capable of stirring communal discontent/disharmony or political unrest or infringe the intellectual property rights, copyright, right of privacy, right of publicity, property rights, moral right, performers' right, performers' property right or any other right whatever of any person</w:t>
+              <w:t>trademark or trade names or any other right of any third party and it shall not be objectionable. obscene, blasphemous, plagiarized, libelous or defamatory or derogatory to any religion or belief, contrary to public policy, or capable of stirring communal discontent/disharmony or political unrest or infringe the intellectual property rights, copyright, right of privacy, right of publicity, property rights, moral right, performers' right, performers' property right or any other right whatever of any person</w:t>
             </w:r>
             <w:r>
               <w:rPr>
@@ -2440,16 +2187,7 @@
                 <w:sz w:val="20"/>
                 <w:szCs w:val="20"/>
               </w:rPr>
-              <w:t xml:space="preserve">he Licensee shall not make the Licensed Song available, distribute, resell, or perform the Licensed </w:t>
-            </w:r>
-            <w:r>
-              <w:rPr>
-                <w:rFonts w:ascii="Times New Roman" w:hAnsi="Times New Roman" w:cs="Times New Roman"/>
-                <w:sz w:val="20"/>
-                <w:szCs w:val="20"/>
-              </w:rPr>
-              <w:lastRenderedPageBreak/>
-              <w:t xml:space="preserve">Song separately from the </w:t>
+              <w:t xml:space="preserve">he Licensee shall not make the Licensed Song available, distribute, resell, or perform the Licensed Song separately from the </w:t>
             </w:r>
             <w:proofErr w:type="gramStart"/>
             <w:r>
@@ -2507,6 +2245,7 @@
                 <w:sz w:val="20"/>
                 <w:szCs w:val="20"/>
               </w:rPr>
+              <w:lastRenderedPageBreak/>
               <w:t>Th</w:t>
             </w:r>
             <w:r>

</xml_diff>

<commit_message>
LicensePDF API changes Addition
</commit_message>
<xml_diff>
--- a/templates/License_Agreement_Template.docx
+++ b/templates/License_Agreement_Template.docx
@@ -770,6 +770,94 @@
           </w:p>
         </w:tc>
       </w:tr>
+      <w:tr>
+        <w:trPr>
+          <w:trHeight w:val="266"/>
+        </w:trPr>
+        <w:tc>
+          <w:tcPr>
+            <w:tcW w:w="1110" w:type="dxa"/>
+          </w:tcPr>
+          <w:p>
+            <w:pPr>
+              <w:pStyle w:val="ListParagraph"/>
+              <w:numPr>
+                <w:ilvl w:val="0"/>
+                <w:numId w:val="35"/>
+              </w:numPr>
+              <w:spacing w:before="0" w:after="0"/>
+              <w:rPr>
+                <w:rFonts w:ascii="Times New Roman" w:hAnsi="Times New Roman" w:cs="Times New Roman"/>
+                <w:b/>
+                <w:bCs/>
+                <w:sz w:val="20"/>
+                <w:szCs w:val="20"/>
+                <w:u w:val="single"/>
+              </w:rPr>
+            </w:pPr>
+          </w:p>
+        </w:tc>
+        <w:tc>
+          <w:tcPr>
+            <w:tcW w:w="3588" w:type="dxa"/>
+          </w:tcPr>
+          <w:p>
+            <w:pPr>
+              <w:pStyle w:val="ListParagraph"/>
+              <w:tabs>
+                <w:tab w:val="left" w:pos="900"/>
+              </w:tabs>
+              <w:spacing w:before="0" w:after="0"/>
+              <w:ind w:left="0"/>
+              <w:rPr>
+                <w:rFonts w:ascii="Times New Roman" w:hAnsi="Times New Roman" w:cs="Times New Roman"/>
+                <w:b/>
+                <w:bCs/>
+                <w:sz w:val="20"/>
+                <w:szCs w:val="20"/>
+              </w:rPr>
+            </w:pPr>
+            <w:proofErr w:type="spellStart"/>
+            <w:r>
+              <w:rPr>
+                <w:rFonts w:ascii="Times New Roman" w:hAnsi="Times New Roman" w:cs="Times New Roman"/>
+                <w:b/>
+                <w:bCs/>
+                <w:sz w:val="20"/>
+                <w:szCs w:val="20"/>
+              </w:rPr>
+              <w:t>LicenseId</w:t>
+            </w:r>
+            <w:proofErr w:type="spellEnd"/>
+          </w:p>
+        </w:tc>
+        <w:tc>
+          <w:tcPr>
+            <w:tcW w:w="4431" w:type="dxa"/>
+          </w:tcPr>
+          <w:p>
+            <w:pPr>
+              <w:tabs>
+                <w:tab w:val="left" w:pos="300"/>
+              </w:tabs>
+              <w:spacing w:before="0" w:after="0"/>
+              <w:rPr>
+                <w:rFonts w:ascii="Times New Roman" w:hAnsi="Times New Roman" w:cs="Times New Roman"/>
+                <w:sz w:val="20"/>
+                <w:szCs w:val="20"/>
+              </w:rPr>
+            </w:pPr>
+            <w:r>
+              <w:rPr>
+                <w:rFonts w:ascii="Times New Roman" w:hAnsi="Times New Roman" w:cs="Times New Roman"/>
+                <w:sz w:val="20"/>
+                <w:szCs w:val="20"/>
+              </w:rPr>
+              <w:t>{licenseId}</w:t>
+            </w:r>
+          </w:p>
+        </w:tc>
+      </w:tr>
     </w:tbl>
     <w:p>
       <w:pPr>
@@ -1716,6 +1804,7 @@
                 <w:sz w:val="20"/>
                 <w:szCs w:val="20"/>
               </w:rPr>
+              <w:lastRenderedPageBreak/>
               <w:t xml:space="preserve">The </w:t>
             </w:r>
             <w:proofErr w:type="gramStart"/>
@@ -1734,16 +1823,7 @@
                 <w:sz w:val="20"/>
                 <w:szCs w:val="20"/>
               </w:rPr>
-              <w:t xml:space="preserve"> Content or any portion thereof, or any of the materials used and/or to be used in the production shall not violate or infringe upon the </w:t>
-            </w:r>
-            <w:r>
-              <w:rPr>
-                <w:rFonts w:ascii="Times New Roman" w:hAnsi="Times New Roman" w:cs="Times New Roman"/>
-                <w:sz w:val="20"/>
-                <w:szCs w:val="20"/>
-              </w:rPr>
-              <w:lastRenderedPageBreak/>
-              <w:t>trademark or trade names or any other right of any third party and it shall not be objectionable. obscene, blasphemous, plagiarized, libelous or defamatory or derogatory to any religion or belief, contrary to public policy, or capable of stirring communal discontent/disharmony or political unrest or infringe the intellectual property rights, copyright, right of privacy, right of publicity, property rights, moral right, performers' right, performers' property right or any other right whatever of any person</w:t>
+              <w:t xml:space="preserve"> Content or any portion thereof, or any of the materials used and/or to be used in the production shall not violate or infringe upon the trademark or trade names or any other right of any third party and it shall not be objectionable. obscene, blasphemous, plagiarized, libelous or defamatory or derogatory to any religion or belief, contrary to public policy, or capable of stirring communal discontent/disharmony or political unrest or infringe the intellectual property rights, copyright, right of privacy, right of publicity, property rights, moral right, performers' right, performers' property right or any other right whatever of any person</w:t>
             </w:r>
             <w:r>
               <w:rPr>
@@ -2187,7 +2267,16 @@
                 <w:sz w:val="20"/>
                 <w:szCs w:val="20"/>
               </w:rPr>
-              <w:t xml:space="preserve">he Licensee shall not make the Licensed Song available, distribute, resell, or perform the Licensed Song separately from the </w:t>
+              <w:t xml:space="preserve">he Licensee shall not make the Licensed Song available, distribute, resell, or perform the Licensed </w:t>
+            </w:r>
+            <w:r>
+              <w:rPr>
+                <w:rFonts w:ascii="Times New Roman" w:hAnsi="Times New Roman" w:cs="Times New Roman"/>
+                <w:sz w:val="20"/>
+                <w:szCs w:val="20"/>
+              </w:rPr>
+              <w:lastRenderedPageBreak/>
+              <w:t xml:space="preserve">Song separately from the </w:t>
             </w:r>
             <w:proofErr w:type="gramStart"/>
             <w:r>
@@ -2245,7 +2334,6 @@
                 <w:sz w:val="20"/>
                 <w:szCs w:val="20"/>
               </w:rPr>
-              <w:lastRenderedPageBreak/>
               <w:t>Th</w:t>
             </w:r>
             <w:r>

</xml_diff>